<commit_message>
docs: Milestone 1 v5 consistency edits for the two-LLM final-test protocol (J.O. copy)
</commit_message>
<xml_diff>
--- a/docs/J_O_INAI6986_Milestone1_v5.docx
+++ b/docs/J_O_INAI6986_Milestone1_v5.docx
@@ -932,7 +932,7 @@
         <w:rPr>
           <w:i w:val="0"/>
         </w:rPr>
-        <w:t>Metric. My committed primary metric is human-judged factual accuracy on answerable questions. For the 192 development outputs (four families × base and adapter × 24 questions), a local AI judge compared each answer with the true source page. An answer counts as fully supported only if it answers the question, is correct, is supported by the page and contains no unsupported claim. The secondary metrics follow the cost asymmetry: an answer with an unsupported claim is the costly error (a confident wrong policy statement), while an abstention is safe but unhelpful. Failed generations stay in the denominator as failures.</w:t>
+        <w:t>Metric. My committed primary metric is human-judged factual accuracy on answerable questions; for the final test I am replacing the human-rated sample with two LLM judges and a code check of citations, a change declared in advance in Milestone 2, Section 2. For the 192 development outputs (four families × base and adapter × 24 questions), a local AI judge compared each answer with the true source page. An answer counts as fully supported only if it answers the question, is correct, is supported by the page and contains no unsupported claim. The secondary metrics follow the cost asymmetry: an answer with an unsupported claim is the costly error (a confident wrong policy statement), while an abstention is safe but unhelpful. Failed generations stay in the denominator as failures.</w:t>
       </w:r>
     </w:p>
     <w:p>
@@ -3161,7 +3161,7 @@
         <w:t xml:space="preserve">The AI judge is reliable for correctness, not for citations. </w:t>
       </w:r>
       <w:r>
-        <w:t>On 12 Nemotron outputs scored by both the AI judge and the human review, they agreed on correctness, support, unsupported claims and the overall pass (12/12), but on citation validity only 3/12: the judge accepted wrong citations. Citation correctness stays a human-checked metric.</w:t>
+        <w:t>On 12 Nemotron outputs scored by both the AI judge and the human review, they agreed on correctness, support, unsupported claims and the overall pass (12/12), but on citation validity only 3/12: the judge accepted wrong citations. In the final test, citation correctness is checked in code against the supplied page, not by an LLM judge.</w:t>
       </w:r>
     </w:p>
     <w:p>
@@ -3738,7 +3738,7 @@
         <w:rPr>
           <w:i w:val="0"/>
         </w:rPr>
-        <w:t>Before the final test: if, given the source passage, the Nemotron adapter produced more unsupported claims than its base on development questions, or if a human review showed Gemma or Ornith making fewer unsupported claims at equal accuracy, I would switch candidates before locking the test. After the final test: the adapter is not promoted unless it beats its untouched base by at least 10 points on answerable accuracy, with at least 95% correct citations, fewer than 2% unsupported claims, at least 90% correct abstention, at least 95% correct safety routing, no more than a 3-point general-task regression and interactive latency. If it misses, I will not tune on the test or swap in a rival. The evidence so far (no gain on 24 questions, a small gain on 15 reviewed questions) would then point to the untouched base model with the source passage supplied, which is simpler and needs no fine-tuning.</w:t>
+        <w:t>Before the final test: if, given the source passage, the Nemotron adapter produced more unsupported claims than its base on development questions, or if a review of development outputs showed Gemma or Ornith making fewer unsupported claims at equal accuracy, I would switch candidates before locking the test. After the final test: the adapter is not promoted unless it beats its untouched base by at least 10 points on answerable accuracy, with at least 95% correct citations, fewer than 2% unsupported claims, at least 90% correct abstention, at least 95% correct safety routing, no more than a 3-point general-task regression and interactive latency. The final test does not measure the last two PM Plan items unless its locked protocol adds them, so promotion would also require checking them. If it misses, I will not tune on the test or swap in a rival. The evidence so far (no gain on 24 questions, a small gain on 15 reviewed questions) would then point to the untouched base model with the source passage supplied, which is simpler and needs no fine-tuning.</w:t>
       </w:r>
     </w:p>
     <w:p>
@@ -3806,7 +3806,7 @@
         <w:rPr>
           <w:i w:val="0"/>
         </w:rPr>
-        <w:t>I used Hermes Agent with GPT-6 Luna and GPT-6.1 Sol (October 1–16) and Claude Opus 5.5 (October 18) to draft and revise this report and to write the analysis and document-building code. Local Qwen models generated the candidate training records and the advisory development scores. I designed the project; chose the models, metrics and split; wrote the 30 control questions; made the duplicate rulings and the Week 8 review ratings; and selected the candidate. I checked the reported figures against the notebook output and remain responsible for the content.</w:t>
+        <w:t>I used Hermes Agent with GPT-6 Luna and GPT-6.1 Sol (October 1–16) and Claude Opus 5.5 and Sonnet 5.5 (October 18) to draft and revise this report and to write the analysis and document-building code. Local Qwen models generated the candidate training records and the advisory development scores. I designed the project; chose the models, metrics and split; wrote the 30 control questions; made the duplicate rulings and the Week 8 review ratings; and selected the candidate. I checked the reported figures against the notebook output and remain responsible for the content.</w:t>
       </w:r>
     </w:p>
     <w:p>

</xml_diff>